<commit_message>
Update 13 DI Heinrich Venter develop an outcome.docx
</commit_message>
<xml_diff>
--- a/13 DI Heinrich Venter develop an outcome.docx
+++ b/13 DI Heinrich Venter develop an outcome.docx
@@ -89,15 +89,7 @@
     </w:p>
     <w:p>
       <w:r>
-        <w:t xml:space="preserve">Examples </w:t>
-      </w:r>
-      <w:proofErr w:type="gramStart"/>
-      <w:r>
-        <w:t>are:</w:t>
-      </w:r>
-      <w:proofErr w:type="gramEnd"/>
-      <w:r>
-        <w:t xml:space="preserve"> social ● cultural ● legal ● ethical ● intellectual property ● privacy ● accessibility ● usability ● functionality ● aesthetics ● sustainability and future proofing ● end-user considerations ● health and safety.</w:t>
+        <w:t>Examples are: social ● cultural ● legal ● ethical ● intellectual property ● privacy ● accessibility ● usability ● functionality ● aesthetics ● sustainability and future proofing ● end-user considerations ● health and safety.</w:t>
       </w:r>
     </w:p>
     <w:tbl>
@@ -207,11 +199,9 @@
             <w:shd w:val="clear" w:color="auto" w:fill="FFCCCC"/>
           </w:tcPr>
           <w:p>
-            <w:proofErr w:type="spellStart"/>
             <w:r>
               <w:t>Accesability</w:t>
             </w:r>
-            <w:proofErr w:type="spellEnd"/>
           </w:p>
         </w:tc>
         <w:tc>
@@ -311,27 +301,7 @@
                       <w:szCs w:val="24"/>
                       <w:lang w:val="en-US"/>
                     </w:rPr>
-                    <w:t xml:space="preserve">Accessibility for the </w:t>
-                  </w:r>
-                  <w:proofErr w:type="spellStart"/>
-                  <w:r>
-                    <w:rPr>
-                      <w:rFonts w:eastAsia="Times New Roman" w:cstheme="minorHAnsi"/>
-                      <w:sz w:val="24"/>
-                      <w:szCs w:val="24"/>
-                      <w:lang w:val="en-US"/>
-                    </w:rPr>
-                    <w:t>pitbike</w:t>
-                  </w:r>
-                  <w:proofErr w:type="spellEnd"/>
-                  <w:r>
-                    <w:rPr>
-                      <w:rFonts w:eastAsia="Times New Roman" w:cstheme="minorHAnsi"/>
-                      <w:sz w:val="24"/>
-                      <w:szCs w:val="24"/>
-                      <w:lang w:val="en-US"/>
-                    </w:rPr>
-                    <w:t xml:space="preserve"> means the bike’s controls, indicators, and basic functions need to be understandable and manageable for a range of riders. This includes clear visual indicators, easy-to-reach switches, and controls that don’t require excessive strength.</w:t>
+                    <w:t>Accessibility for the pitbike means the bike’s controls, indicators, and basic functions need to be understandable and manageable for a range of riders. This includes clear visual indicators, easy-to-reach switches, and controls that don’t require excessive strength.</w:t>
                   </w:r>
                 </w:p>
               </w:tc>
@@ -382,15 +352,7 @@
           </w:tcPr>
           <w:p>
             <w:r>
-              <w:t xml:space="preserve">Usability relates to how easy it is to understand and use the </w:t>
-            </w:r>
-            <w:proofErr w:type="spellStart"/>
-            <w:r>
-              <w:t>pitbike’s</w:t>
-            </w:r>
-            <w:proofErr w:type="spellEnd"/>
-            <w:r>
-              <w:t xml:space="preserve"> hybrid systems, such as switching modes, checking battery levels, or starting the bike. The design needs to feel intuitive even for new riders.</w:t>
+              <w:t>Usability relates to how easy it is to understand and use the pitbike’s hybrid systems, such as switching modes, checking battery levels, or starting the bike. The design needs to feel intuitive even for new riders.</w:t>
             </w:r>
           </w:p>
         </w:tc>
@@ -401,23 +363,7 @@
           </w:tcPr>
           <w:p>
             <w:r>
-              <w:t xml:space="preserve">It matters because if the interface is confusing, the rider could misuse the bike or struggle during operation. I will address this by keeping the hybrid controls simple, limiting unnecessary switches, and providing a logical layout </w:t>
-            </w:r>
-            <w:proofErr w:type="gramStart"/>
-            <w:r>
-              <w:t>similar to</w:t>
-            </w:r>
-            <w:proofErr w:type="gramEnd"/>
-            <w:r>
-              <w:t xml:space="preserve"> standard </w:t>
-            </w:r>
-            <w:proofErr w:type="spellStart"/>
-            <w:r>
-              <w:t>pitbikes</w:t>
-            </w:r>
-            <w:proofErr w:type="spellEnd"/>
-            <w:r>
-              <w:t xml:space="preserve"> so it feels familiar.</w:t>
+              <w:t>It matters because if the interface is confusing, the rider could misuse the bike or struggle during operation. I will address this by keeping the hybrid controls simple, limiting unnecessary switches, and providing a logical layout similar to standard pitbikes so it feels familiar.</w:t>
             </w:r>
           </w:p>
         </w:tc>
@@ -538,27 +484,7 @@
                       <w:szCs w:val="24"/>
                       <w:lang w:val="en-US"/>
                     </w:rPr>
-                    <w:t xml:space="preserve">Functionality refers to how well the 70cc hybrid </w:t>
-                  </w:r>
-                  <w:proofErr w:type="spellStart"/>
-                  <w:r>
-                    <w:rPr>
-                      <w:rFonts w:eastAsia="Times New Roman" w:cstheme="minorHAnsi"/>
-                      <w:sz w:val="24"/>
-                      <w:szCs w:val="24"/>
-                      <w:lang w:val="en-US"/>
-                    </w:rPr>
-                    <w:t>pitbike</w:t>
-                  </w:r>
-                  <w:proofErr w:type="spellEnd"/>
-                  <w:r>
-                    <w:rPr>
-                      <w:rFonts w:eastAsia="Times New Roman" w:cstheme="minorHAnsi"/>
-                      <w:sz w:val="24"/>
-                      <w:szCs w:val="24"/>
-                      <w:lang w:val="en-US"/>
-                    </w:rPr>
-                    <w:t xml:space="preserve"> performs its intended purpose—delivering reliable petrol and electric operation, smooth power delivery, and stable riding. It also includes ensuring the components (battery, controller, mechanical systems) work together correctly.</w:t>
+                    <w:t>Functionality refers to how well the 70cc hybrid pitbike performs its intended purpose—delivering reliable petrol and electric operation, smooth power delivery, and stable riding. It also includes ensuring the components (battery, controller, mechanical systems) work together correctly.</w:t>
                   </w:r>
                 </w:p>
               </w:tc>
@@ -605,15 +531,7 @@
           </w:tcPr>
           <w:p>
             <w:r>
-              <w:t xml:space="preserve">Aesthetics for the </w:t>
-            </w:r>
-            <w:proofErr w:type="spellStart"/>
-            <w:r>
-              <w:t>pitbike</w:t>
-            </w:r>
-            <w:proofErr w:type="spellEnd"/>
-            <w:r>
-              <w:t xml:space="preserve"> include the visual design—how the hybrid components are integrated, how tidy the wiring is, and the overall look of the bike. A clean, professional aesthetic helps the bike feel intentional rather than thrown together.</w:t>
+              <w:t>Aesthetics for the pitbike include the visual design—how the hybrid components are integrated, how tidy the wiring is, and the overall look of the bike. A clean, professional aesthetic helps the bike feel intentional rather than thrown together.</w:t>
             </w:r>
           </w:p>
         </w:tc>
@@ -823,15 +741,7 @@
               <w:t>Description:</w:t>
             </w:r>
             <w:r>
-              <w:t xml:space="preserve"> using </w:t>
-            </w:r>
-            <w:proofErr w:type="spellStart"/>
-            <w:r>
-              <w:t>github</w:t>
-            </w:r>
-            <w:proofErr w:type="spellEnd"/>
-            <w:r>
-              <w:t xml:space="preserve"> that saves every version history so there is a mistake or something that is changed incorrectly you can go </w:t>
+              <w:t xml:space="preserve"> using github that saves every version history so there is a mistake or something that is changed incorrectly you can go </w:t>
             </w:r>
             <w:r>
               <w:t>back</w:t>
@@ -877,26 +787,10 @@
               <w:t>Every time</w:t>
             </w:r>
             <w:r>
-              <w:t xml:space="preserve"> I close my files so that </w:t>
-            </w:r>
-            <w:proofErr w:type="gramStart"/>
-            <w:r>
-              <w:t>its</w:t>
-            </w:r>
-            <w:proofErr w:type="gramEnd"/>
-            <w:r>
-              <w:t xml:space="preserve"> saved when I close my </w:t>
-            </w:r>
-            <w:r>
-              <w:t xml:space="preserve">laptop/computer and if I need to go back to a previous file that was </w:t>
-            </w:r>
-            <w:proofErr w:type="gramStart"/>
-            <w:r>
-              <w:t>deleted</w:t>
-            </w:r>
-            <w:proofErr w:type="gramEnd"/>
-            <w:r>
-              <w:t xml:space="preserve"> I can recover the file without redoing that work all over again</w:t>
+              <w:t xml:space="preserve"> I close my files so that its saved when I close my </w:t>
+            </w:r>
+            <w:r>
+              <w:t>laptop/computer and if I need to go back to a previous file that was deleted I can recover the file without redoing that work all over again</w:t>
             </w:r>
           </w:p>
         </w:tc>
@@ -912,7 +806,45 @@
               <w:t>Evidence 1:</w:t>
             </w:r>
           </w:p>
-          <w:p/>
+          <w:p>
+            <w:r>
+              <w:drawing>
+                <wp:inline distT="0" distB="0" distL="0" distR="0" wp14:anchorId="35C9ED11" wp14:editId="11C4454E">
+                  <wp:extent cx="2070625" cy="1118128"/>
+                  <wp:effectExtent l="0" t="0" r="6350" b="6350"/>
+                  <wp:docPr id="1970155301" name="Picture 1"/>
+                  <wp:cNvGraphicFramePr>
+                    <a:graphicFrameLocks xmlns:a="http://schemas.openxmlformats.org/drawingml/2006/main" noChangeAspect="1"/>
+                  </wp:cNvGraphicFramePr>
+                  <a:graphic xmlns:a="http://schemas.openxmlformats.org/drawingml/2006/main">
+                    <a:graphicData uri="http://schemas.openxmlformats.org/drawingml/2006/picture">
+                      <pic:pic xmlns:pic="http://schemas.openxmlformats.org/drawingml/2006/picture">
+                        <pic:nvPicPr>
+                          <pic:cNvPr id="1970155301" name=""/>
+                          <pic:cNvPicPr/>
+                        </pic:nvPicPr>
+                        <pic:blipFill>
+                          <a:blip r:embed="rId9"/>
+                          <a:stretch>
+                            <a:fillRect/>
+                          </a:stretch>
+                        </pic:blipFill>
+                        <pic:spPr>
+                          <a:xfrm>
+                            <a:off x="0" y="0"/>
+                            <a:ext cx="2107374" cy="1137972"/>
+                          </a:xfrm>
+                          <a:prstGeom prst="rect">
+                            <a:avLst/>
+                          </a:prstGeom>
+                        </pic:spPr>
+                      </pic:pic>
+                    </a:graphicData>
+                  </a:graphic>
+                </wp:inline>
+              </w:drawing>
+            </w:r>
+          </w:p>
         </w:tc>
         <w:tc>
           <w:tcPr>
@@ -956,7 +888,7 @@
                           <pic:cNvPicPr/>
                         </pic:nvPicPr>
                         <pic:blipFill>
-                          <a:blip r:embed="rId9"/>
+                          <a:blip r:embed="rId10"/>
                           <a:stretch>
                             <a:fillRect/>
                           </a:stretch>
@@ -998,6 +930,240 @@
               <w:t>Evidence 3:</w:t>
             </w:r>
           </w:p>
+          <w:p>
+            <w:r>
+              <w:drawing>
+                <wp:inline distT="0" distB="0" distL="0" distR="0" wp14:anchorId="7CD95EC6" wp14:editId="12049D04">
+                  <wp:extent cx="2100853" cy="1133055"/>
+                  <wp:effectExtent l="0" t="0" r="0" b="0"/>
+                  <wp:docPr id="742144263" name="Picture 1"/>
+                  <wp:cNvGraphicFramePr>
+                    <a:graphicFrameLocks xmlns:a="http://schemas.openxmlformats.org/drawingml/2006/main" noChangeAspect="1"/>
+                  </wp:cNvGraphicFramePr>
+                  <a:graphic xmlns:a="http://schemas.openxmlformats.org/drawingml/2006/main">
+                    <a:graphicData uri="http://schemas.openxmlformats.org/drawingml/2006/picture">
+                      <pic:pic xmlns:pic="http://schemas.openxmlformats.org/drawingml/2006/picture">
+                        <pic:nvPicPr>
+                          <pic:cNvPr id="742144263" name=""/>
+                          <pic:cNvPicPr/>
+                        </pic:nvPicPr>
+                        <pic:blipFill>
+                          <a:blip r:embed="rId11"/>
+                          <a:stretch>
+                            <a:fillRect/>
+                          </a:stretch>
+                        </pic:blipFill>
+                        <pic:spPr>
+                          <a:xfrm>
+                            <a:off x="0" y="0"/>
+                            <a:ext cx="2121957" cy="1144437"/>
+                          </a:xfrm>
+                          <a:prstGeom prst="rect">
+                            <a:avLst/>
+                          </a:prstGeom>
+                        </pic:spPr>
+                      </pic:pic>
+                    </a:graphicData>
+                  </a:graphic>
+                </wp:inline>
+              </w:drawing>
+            </w:r>
+          </w:p>
+        </w:tc>
+        <w:tc>
+          <w:tcPr>
+            <w:tcW w:w="6011" w:type="dxa"/>
+            <w:vMerge/>
+            <w:shd w:val="clear" w:color="auto" w:fill="FFCCCC"/>
+          </w:tcPr>
+          <w:p/>
+        </w:tc>
+      </w:tr>
+    </w:tbl>
+    <w:p/>
+    <w:tbl>
+      <w:tblPr>
+        <w:tblStyle w:val="TableGrid"/>
+        <w:tblW w:w="0" w:type="auto"/>
+        <w:tblLook w:val="04A0" w:firstRow="1" w:lastRow="0" w:firstColumn="1" w:lastColumn="0" w:noHBand="0" w:noVBand="1"/>
+      </w:tblPr>
+      <w:tblGrid>
+        <w:gridCol w:w="3548"/>
+        <w:gridCol w:w="5468"/>
+      </w:tblGrid>
+      <w:tr>
+        <w:tc>
+          <w:tcPr>
+            <w:tcW w:w="9016" w:type="dxa"/>
+            <w:gridSpan w:val="2"/>
+            <w:shd w:val="clear" w:color="auto" w:fill="FF7C80"/>
+          </w:tcPr>
+          <w:p>
+            <w:r>
+              <w:lastRenderedPageBreak/>
+              <w:t>Project Management Tool:</w:t>
+            </w:r>
+            <w:r>
+              <w:t xml:space="preserve"> Gantt chart </w:t>
+            </w:r>
+          </w:p>
+        </w:tc>
+      </w:tr>
+      <w:tr>
+        <w:tc>
+          <w:tcPr>
+            <w:tcW w:w="3005" w:type="dxa"/>
+            <w:shd w:val="clear" w:color="auto" w:fill="FF7C80"/>
+          </w:tcPr>
+          <w:p>
+            <w:r>
+              <w:t>Description:</w:t>
+            </w:r>
+            <w:r>
+              <w:t xml:space="preserve"> so that you can keep up with your project to see how hard you need to work to get to where you need to be to make a good outcome of your project</w:t>
+            </w:r>
+          </w:p>
+        </w:tc>
+        <w:tc>
+          <w:tcPr>
+            <w:tcW w:w="6011" w:type="dxa"/>
+            <w:shd w:val="clear" w:color="auto" w:fill="FFCCCC"/>
+          </w:tcPr>
+          <w:p/>
+          <w:p/>
+          <w:p/>
+          <w:p/>
+        </w:tc>
+      </w:tr>
+      <w:tr>
+        <w:tc>
+          <w:tcPr>
+            <w:tcW w:w="3005" w:type="dxa"/>
+            <w:shd w:val="clear" w:color="auto" w:fill="FF7C80"/>
+          </w:tcPr>
+          <w:p>
+            <w:r>
+              <w:t>How often did you use it:</w:t>
+            </w:r>
+          </w:p>
+        </w:tc>
+        <w:tc>
+          <w:tcPr>
+            <w:tcW w:w="6011" w:type="dxa"/>
+            <w:shd w:val="clear" w:color="auto" w:fill="FFCCCC"/>
+          </w:tcPr>
+          <w:p>
+            <w:r>
+              <w:t>Every week I check and update the gnat chart to check we</w:t>
+            </w:r>
+            <w:r>
+              <w:t>a</w:t>
+            </w:r>
+            <w:r>
+              <w:t>ther im on schedule falling behin</w:t>
+            </w:r>
+            <w:r>
+              <w:t>d or even in best case scenario ahead f schedule</w:t>
+            </w:r>
+          </w:p>
+        </w:tc>
+      </w:tr>
+      <w:tr>
+        <w:tc>
+          <w:tcPr>
+            <w:tcW w:w="3005" w:type="dxa"/>
+            <w:shd w:val="clear" w:color="auto" w:fill="FF7C80"/>
+          </w:tcPr>
+          <w:p>
+            <w:r>
+              <w:t>Evidence 1:</w:t>
+            </w:r>
+            <w:r>
+              <w:rPr>
+                <w:noProof/>
+              </w:rPr>
+              <w:t xml:space="preserve"> </w:t>
+            </w:r>
+            <w:r>
+              <w:drawing>
+                <wp:inline distT="0" distB="0" distL="0" distR="0" wp14:anchorId="4F2785B2" wp14:editId="3274FA68">
+                  <wp:extent cx="2115967" cy="736345"/>
+                  <wp:effectExtent l="0" t="0" r="0" b="6985"/>
+                  <wp:docPr id="843095241" name="Picture 1"/>
+                  <wp:cNvGraphicFramePr>
+                    <a:graphicFrameLocks xmlns:a="http://schemas.openxmlformats.org/drawingml/2006/main" noChangeAspect="1"/>
+                  </wp:cNvGraphicFramePr>
+                  <a:graphic xmlns:a="http://schemas.openxmlformats.org/drawingml/2006/main">
+                    <a:graphicData uri="http://schemas.openxmlformats.org/drawingml/2006/picture">
+                      <pic:pic xmlns:pic="http://schemas.openxmlformats.org/drawingml/2006/picture">
+                        <pic:nvPicPr>
+                          <pic:cNvPr id="843095241" name=""/>
+                          <pic:cNvPicPr/>
+                        </pic:nvPicPr>
+                        <pic:blipFill>
+                          <a:blip r:embed="rId12"/>
+                          <a:stretch>
+                            <a:fillRect/>
+                          </a:stretch>
+                        </pic:blipFill>
+                        <pic:spPr>
+                          <a:xfrm>
+                            <a:off x="0" y="0"/>
+                            <a:ext cx="2173066" cy="756215"/>
+                          </a:xfrm>
+                          <a:prstGeom prst="rect">
+                            <a:avLst/>
+                          </a:prstGeom>
+                        </pic:spPr>
+                      </pic:pic>
+                    </a:graphicData>
+                  </a:graphic>
+                </wp:inline>
+              </w:drawing>
+            </w:r>
+          </w:p>
+        </w:tc>
+        <w:tc>
+          <w:tcPr>
+            <w:tcW w:w="6011" w:type="dxa"/>
+            <w:vMerge w:val="restart"/>
+            <w:shd w:val="clear" w:color="auto" w:fill="FFCCCC"/>
+          </w:tcPr>
+          <w:p/>
+        </w:tc>
+      </w:tr>
+      <w:tr>
+        <w:tc>
+          <w:tcPr>
+            <w:tcW w:w="3005" w:type="dxa"/>
+            <w:shd w:val="clear" w:color="auto" w:fill="FF7C80"/>
+          </w:tcPr>
+          <w:p>
+            <w:r>
+              <w:t>Evidence 2:</w:t>
+            </w:r>
+          </w:p>
+        </w:tc>
+        <w:tc>
+          <w:tcPr>
+            <w:tcW w:w="6011" w:type="dxa"/>
+            <w:vMerge/>
+            <w:shd w:val="clear" w:color="auto" w:fill="FFCCCC"/>
+          </w:tcPr>
+          <w:p/>
+        </w:tc>
+      </w:tr>
+      <w:tr>
+        <w:tc>
+          <w:tcPr>
+            <w:tcW w:w="3005" w:type="dxa"/>
+            <w:shd w:val="clear" w:color="auto" w:fill="FF7C80"/>
+          </w:tcPr>
+          <w:p>
+            <w:r>
+              <w:t>Evidence 3:</w:t>
+            </w:r>
+          </w:p>
         </w:tc>
         <w:tc>
           <w:tcPr>
@@ -1032,174 +1198,6 @@
               <w:t>Project Management Tool:</w:t>
             </w:r>
             <w:r>
-              <w:t xml:space="preserve"> Gantt chart </w:t>
-            </w:r>
-          </w:p>
-        </w:tc>
-      </w:tr>
-      <w:tr>
-        <w:tc>
-          <w:tcPr>
-            <w:tcW w:w="3005" w:type="dxa"/>
-            <w:shd w:val="clear" w:color="auto" w:fill="FF7C80"/>
-          </w:tcPr>
-          <w:p>
-            <w:r>
-              <w:t>Description:</w:t>
-            </w:r>
-            <w:r>
-              <w:t xml:space="preserve"> so that you can keep0 up w9ith your project to see how hard you need to work to get to where you need to be to make a good outcome of your project</w:t>
-            </w:r>
-          </w:p>
-        </w:tc>
-        <w:tc>
-          <w:tcPr>
-            <w:tcW w:w="6011" w:type="dxa"/>
-            <w:shd w:val="clear" w:color="auto" w:fill="FFCCCC"/>
-          </w:tcPr>
-          <w:p/>
-          <w:p/>
-          <w:p/>
-          <w:p/>
-        </w:tc>
-      </w:tr>
-      <w:tr>
-        <w:tc>
-          <w:tcPr>
-            <w:tcW w:w="3005" w:type="dxa"/>
-            <w:shd w:val="clear" w:color="auto" w:fill="FF7C80"/>
-          </w:tcPr>
-          <w:p>
-            <w:r>
-              <w:t>How often did you use it:</w:t>
-            </w:r>
-          </w:p>
-        </w:tc>
-        <w:tc>
-          <w:tcPr>
-            <w:tcW w:w="6011" w:type="dxa"/>
-            <w:shd w:val="clear" w:color="auto" w:fill="FFCCCC"/>
-          </w:tcPr>
-          <w:p>
-            <w:r>
-              <w:t>Every week I check and update the gnat chart to check we</w:t>
-            </w:r>
-            <w:r>
-              <w:t>a</w:t>
-            </w:r>
-            <w:r>
-              <w:t xml:space="preserve">ther </w:t>
-            </w:r>
-            <w:proofErr w:type="spellStart"/>
-            <w:r>
-              <w:t>im</w:t>
-            </w:r>
-            <w:proofErr w:type="spellEnd"/>
-            <w:r>
-              <w:t xml:space="preserve"> on schedule falling behin</w:t>
-            </w:r>
-            <w:r>
-              <w:t xml:space="preserve">d or even in best case scenario ahead </w:t>
-            </w:r>
-            <w:proofErr w:type="spellStart"/>
-            <w:r>
-              <w:t>f</w:t>
-            </w:r>
-            <w:proofErr w:type="spellEnd"/>
-            <w:r>
-              <w:t xml:space="preserve"> schedule</w:t>
-            </w:r>
-          </w:p>
-        </w:tc>
-      </w:tr>
-      <w:tr>
-        <w:tc>
-          <w:tcPr>
-            <w:tcW w:w="3005" w:type="dxa"/>
-            <w:shd w:val="clear" w:color="auto" w:fill="FF7C80"/>
-          </w:tcPr>
-          <w:p>
-            <w:r>
-              <w:t>Evidence 1:</w:t>
-            </w:r>
-          </w:p>
-        </w:tc>
-        <w:tc>
-          <w:tcPr>
-            <w:tcW w:w="6011" w:type="dxa"/>
-            <w:vMerge w:val="restart"/>
-            <w:shd w:val="clear" w:color="auto" w:fill="FFCCCC"/>
-          </w:tcPr>
-          <w:p/>
-        </w:tc>
-      </w:tr>
-      <w:tr>
-        <w:tc>
-          <w:tcPr>
-            <w:tcW w:w="3005" w:type="dxa"/>
-            <w:shd w:val="clear" w:color="auto" w:fill="FF7C80"/>
-          </w:tcPr>
-          <w:p>
-            <w:r>
-              <w:t>Evidence 2:</w:t>
-            </w:r>
-          </w:p>
-        </w:tc>
-        <w:tc>
-          <w:tcPr>
-            <w:tcW w:w="6011" w:type="dxa"/>
-            <w:vMerge/>
-            <w:shd w:val="clear" w:color="auto" w:fill="FFCCCC"/>
-          </w:tcPr>
-          <w:p/>
-        </w:tc>
-      </w:tr>
-      <w:tr>
-        <w:tc>
-          <w:tcPr>
-            <w:tcW w:w="3005" w:type="dxa"/>
-            <w:shd w:val="clear" w:color="auto" w:fill="FF7C80"/>
-          </w:tcPr>
-          <w:p>
-            <w:r>
-              <w:lastRenderedPageBreak/>
-              <w:t>Evidence 3:</w:t>
-            </w:r>
-          </w:p>
-        </w:tc>
-        <w:tc>
-          <w:tcPr>
-            <w:tcW w:w="6011" w:type="dxa"/>
-            <w:vMerge/>
-            <w:shd w:val="clear" w:color="auto" w:fill="FFCCCC"/>
-          </w:tcPr>
-          <w:p/>
-        </w:tc>
-      </w:tr>
-    </w:tbl>
-    <w:p/>
-    <w:tbl>
-      <w:tblPr>
-        <w:tblStyle w:val="TableGrid"/>
-        <w:tblW w:w="0" w:type="auto"/>
-        <w:tblLook w:val="04A0" w:firstRow="1" w:lastRow="0" w:firstColumn="1" w:lastColumn="0" w:noHBand="0" w:noVBand="1"/>
-      </w:tblPr>
-      <w:tblGrid>
-        <w:gridCol w:w="3005"/>
-        <w:gridCol w:w="6011"/>
-      </w:tblGrid>
-      <w:tr>
-        <w:tc>
-          <w:tcPr>
-            <w:tcW w:w="9016" w:type="dxa"/>
-            <w:gridSpan w:val="2"/>
-            <w:shd w:val="clear" w:color="auto" w:fill="FF7C80"/>
-          </w:tcPr>
-          <w:p>
-            <w:r>
-              <w:t>Project Management Tool:</w:t>
-            </w:r>
-            <w:r>
               <w:t xml:space="preserve"> </w:t>
             </w:r>
           </w:p>
@@ -1385,21 +1383,8 @@
           </w:tcPr>
           <w:p>
             <w:r>
-              <w:t xml:space="preserve">Designing the required components holders so that when in use the sensitive electronics doesn’t get damaged or broken and then gives faulty readings to the brain which can </w:t>
-            </w:r>
-            <w:proofErr w:type="gramStart"/>
-            <w:r>
-              <w:t>effect</w:t>
-            </w:r>
-            <w:proofErr w:type="gramEnd"/>
-            <w:r>
-              <w:t xml:space="preserve"> efficiency and </w:t>
-            </w:r>
-            <w:proofErr w:type="spellStart"/>
-            <w:r>
-              <w:t>controll</w:t>
-            </w:r>
-            <w:proofErr w:type="spellEnd"/>
+              <w:t>Designing the required components holders so that when in use the sensitive electronics doesn’t get damaged or broken and then gives faulty readings to the brain which can effect efficiency and controll</w:t>
+            </w:r>
           </w:p>
         </w:tc>
       </w:tr>
@@ -1422,15 +1407,7 @@
           </w:tcPr>
           <w:p>
             <w:r>
-              <w:t xml:space="preserve">Using the right electronics for what </w:t>
-            </w:r>
-            <w:proofErr w:type="spellStart"/>
-            <w:r>
-              <w:t>i</w:t>
-            </w:r>
-            <w:proofErr w:type="spellEnd"/>
-            <w:r>
-              <w:t xml:space="preserve"> need it to do and figuring out where all the parts need to sit</w:t>
+              <w:t>Using the right electronics for what i need it to do and figuring out where all the parts need to sit</w:t>
             </w:r>
           </w:p>
         </w:tc>
@@ -1442,13 +1419,8 @@
             <w:shd w:val="clear" w:color="auto" w:fill="FFCCCC"/>
           </w:tcPr>
           <w:p>
-            <w:proofErr w:type="spellStart"/>
-            <w:r>
-              <w:t>Easthetics</w:t>
-            </w:r>
-            <w:proofErr w:type="spellEnd"/>
-            <w:r>
-              <w:t xml:space="preserve"> </w:t>
+            <w:r>
+              <w:t xml:space="preserve">Easthetics </w:t>
             </w:r>
           </w:p>
         </w:tc>
@@ -1509,6 +1481,7 @@
     <w:p/>
     <w:p>
       <w:r>
+        <w:lastRenderedPageBreak/>
         <w:t>Select a component such has story board, trial different techniques or other components and select which one you will use:</w:t>
       </w:r>
     </w:p>
@@ -1570,7 +1543,6 @@
     </w:p>
     <w:p>
       <w:r>
-        <w:lastRenderedPageBreak/>
         <w:t>1 being that the electric motor only has a rpm limit of 2750 rpm and the 70cc can reach rpm speeds at the drive shaft of up to 4000-5000 rpm which 9is way higher than the motor can safely handle</w:t>
       </w:r>
     </w:p>
@@ -1678,15 +1650,7 @@
               <w:t>Selected Component:</w:t>
             </w:r>
             <w:r>
-              <w:t xml:space="preserve"> </w:t>
-            </w:r>
-            <w:proofErr w:type="spellStart"/>
-            <w:r>
-              <w:t>im</w:t>
-            </w:r>
-            <w:proofErr w:type="spellEnd"/>
-            <w:r>
-              <w:t xml:space="preserve"> going with electromagnetic </w:t>
+              <w:t xml:space="preserve"> im going with electromagnetic </w:t>
             </w:r>
           </w:p>
         </w:tc>
@@ -1703,31 +1667,7 @@
               <w:t>Why:</w:t>
             </w:r>
             <w:r>
-              <w:t xml:space="preserve"> because with an electromagnetic you can have torque  and speed from 0rpm where with a centrifugal it needs to be spun to a certain set rpm i.e. 2000 rpm which means ill have about 750 rpm of speed range not including gear ratios for  inc4reasinf the torque of the system which means that </w:t>
-            </w:r>
-            <w:proofErr w:type="spellStart"/>
-            <w:r>
-              <w:t>ill</w:t>
-            </w:r>
-            <w:proofErr w:type="spellEnd"/>
-            <w:r>
-              <w:t xml:space="preserve"> have to use the 70cc’s torque which isn’t the greatest and until the engine reaches the range of where the clutch can engage </w:t>
-            </w:r>
-            <w:proofErr w:type="spellStart"/>
-            <w:r>
-              <w:t>ill</w:t>
-            </w:r>
-            <w:proofErr w:type="spellEnd"/>
-            <w:r>
-              <w:t xml:space="preserve"> be able to accelerate an extra 2km/h where  with </w:t>
-            </w:r>
-            <w:proofErr w:type="spellStart"/>
-            <w:r>
-              <w:t>a</w:t>
-            </w:r>
-            <w:proofErr w:type="spellEnd"/>
-            <w:r>
-              <w:t xml:space="preserve"> electromagnetic I can engage from 0rpm and then have a speed range of 2750 from the motor which means ill have a 50km/h range of where it can accelerate with the electric motors torque which is greater at low speeds than the 70cc’s</w:t>
+              <w:t xml:space="preserve"> because with an electromagnetic you can have torque  and speed from 0rpm where with a centrifugal it needs to be spun to a certain set rpm i.e. 2000 rpm which means ill have about 750 rpm of speed range not including gear ratios for  inc4reasinf the torque of the system which means that ill have to use the 70cc’s torque which isn’t the greatest and until the engine reaches the range of where the clutch can engage ill be able to accelerate an extra 2km/h where  with a electromagnetic I can engage from 0rpm and then have a speed range of 2750 from the motor which means ill have a 50km/h range of where it can accelerate with the electric motors torque which is greater at low speeds than the 70cc’s</w:t>
             </w:r>
           </w:p>
         </w:tc>
@@ -1848,15 +1788,7 @@
               <w:t>Why:</w:t>
             </w:r>
             <w:r>
-              <w:t xml:space="preserve"> because with a potentiometer it is physically being moved which has f4rictio and can wear out where with a hall effect sensor it’s a magnet which is touching so no </w:t>
-            </w:r>
-            <w:proofErr w:type="gramStart"/>
-            <w:r>
-              <w:t>friction</w:t>
-            </w:r>
-            <w:proofErr w:type="gramEnd"/>
-            <w:r>
-              <w:t xml:space="preserve"> so it lasts way longer </w:t>
+              <w:t xml:space="preserve"> because with a potentiometer it is physically being moved which has f4rictio and can wear out where with a hall effect sensor it’s a magnet which is touching so no friction so it lasts way longer </w:t>
             </w:r>
           </w:p>
         </w:tc>
@@ -1928,13 +1860,8 @@
             <w:shd w:val="clear" w:color="auto" w:fill="FFF2CC" w:themeFill="accent4" w:themeFillTint="33"/>
           </w:tcPr>
           <w:p>
-            <w:proofErr w:type="spellStart"/>
-            <w:r>
-              <w:t>Oled</w:t>
-            </w:r>
-            <w:proofErr w:type="spellEnd"/>
-            <w:r>
-              <w:t xml:space="preserve"> </w:t>
+            <w:r>
+              <w:t xml:space="preserve">Oled </w:t>
             </w:r>
             <w:r>
               <w:t xml:space="preserve">display </w:t>
@@ -2003,35 +1930,14 @@
               <w:rPr>
                 <w:lang w:val="en-US"/>
               </w:rPr>
-              <w:t>The chosen 1.3" I2C OLED display is the optimal choice for this system as it balances pixel-level graphic control (128x64 resolution) with high efficiency, vastly outperforming Alternative 1 (LCD screen</w:t>
-            </w:r>
-            <w:proofErr w:type="gramStart"/>
+              <w:t xml:space="preserve">The chosen 1.3" I2C OLED display is the optimal choice for this system as it balances pixel-level graphic control (128x64 resolution) with high efficiency, vastly outperforming Alternative 1 (LCD screen) , which is limited to rigid character blocks, requires a high-draw backlight, and offers </w:t>
+            </w:r>
             <w:r>
               <w:rPr>
                 <w:lang w:val="en-US"/>
               </w:rPr>
-              <w:t>) ,</w:t>
-            </w:r>
-            <w:proofErr w:type="gramEnd"/>
-            <w:r>
-              <w:rPr>
-                <w:lang w:val="en-US"/>
-              </w:rPr>
-              <w:t xml:space="preserve"> which is limited to rigid character blocks, requires a high-draw backlight, and offers poor viewing angles. Because OLED pixels are self-emissive, unlit black pixels consume virtually zero power, making it ideal for low-power microcontrollers deployment. Additionally, while Alternative 2 (1.8" SPI TFT Color Display) provides vibrant colors, its SPI interface requires 4 to 5 data pins, which limits available inputs and complicates wiring. In contrast, the chosen OLED uses the I2C </w:t>
-            </w:r>
-            <w:proofErr w:type="gramStart"/>
-            <w:r>
-              <w:rPr>
-                <w:lang w:val="en-US"/>
-              </w:rPr>
-              <w:t>protocol ,</w:t>
-            </w:r>
-            <w:proofErr w:type="gramEnd"/>
-            <w:r>
-              <w:rPr>
-                <w:lang w:val="en-US"/>
-              </w:rPr>
-              <w:t xml:space="preserve"> requiring only two shared lines (SDA and SCL). This preserves critical GPIO pins for other sensors, simplifies breadboard layout, and ensures a compact, power-efficient, and easily scalable system architecture.</w:t>
+              <w:lastRenderedPageBreak/>
+              <w:t>poor viewing angles. Because OLED pixels are self-emissive, unlit black pixels consume virtually zero power, making it ideal for low-power microcontrollers deployment. Additionally, while Alternative 2 (1.8" SPI TFT Color Display) provides vibrant colors, its SPI interface requires 4 to 5 data pins, which limits available inputs and complicates wiring. In contrast, the chosen OLED uses the I2C protocol , requiring only two shared lines (SDA and SCL). This preserves critical GPIO pins for other sensors, simplifies breadboard layout, and ensures a compact, power-efficient, and easily scalable system architecture.</w:t>
             </w:r>
           </w:p>
           <w:p/>
@@ -2067,7 +1973,6 @@
         <w:rPr>
           <w:b/>
         </w:rPr>
-        <w:lastRenderedPageBreak/>
         <w:t>Component 1:</w:t>
       </w:r>
       <w:r>
@@ -2154,21 +2059,13 @@
           </w:tcPr>
           <w:p>
             <w:r>
-              <w:t xml:space="preserve">To small inner </w:t>
-            </w:r>
-            <w:proofErr w:type="spellStart"/>
-            <w:r>
-              <w:t>di</w:t>
+              <w:t>To small inner di</w:t>
             </w:r>
             <w:r>
               <w:t>a</w:t>
             </w:r>
             <w:r>
-              <w:t>mter</w:t>
-            </w:r>
-            <w:proofErr w:type="spellEnd"/>
-            <w:r>
-              <w:t xml:space="preserve"> </w:t>
+              <w:t xml:space="preserve">mter </w:t>
             </w:r>
           </w:p>
         </w:tc>
@@ -2300,27 +2197,13 @@
         <w:rPr>
           <w:b/>
         </w:rPr>
-        <w:t xml:space="preserve">Component </w:t>
-      </w:r>
-      <w:proofErr w:type="gramStart"/>
+        <w:t>Component 2:</w:t>
+      </w:r>
       <w:r>
         <w:rPr>
           <w:b/>
         </w:rPr>
-        <w:t>2:</w:t>
-      </w:r>
-      <w:r>
-        <w:rPr>
-          <w:b/>
-        </w:rPr>
-        <w:t>throttle</w:t>
-      </w:r>
-      <w:proofErr w:type="gramEnd"/>
-      <w:r>
-        <w:rPr>
-          <w:b/>
-        </w:rPr>
-        <w:t xml:space="preserve"> </w:t>
+        <w:t xml:space="preserve">throttle </w:t>
       </w:r>
     </w:p>
     <w:tbl>
@@ -2391,15 +2274,7 @@
           </w:tcPr>
           <w:p>
             <w:r>
-              <w:t xml:space="preserve">The stopper is on the wrong </w:t>
-            </w:r>
-            <w:proofErr w:type="gramStart"/>
-            <w:r>
-              <w:t>side</w:t>
-            </w:r>
-            <w:proofErr w:type="gramEnd"/>
-            <w:r>
-              <w:t xml:space="preserve"> and the </w:t>
+              <w:t xml:space="preserve">The stopper is on the wrong side and the </w:t>
             </w:r>
             <w:r>
               <w:t>main part is very brittle</w:t>
@@ -2591,50 +2466,19 @@
           </w:tcPr>
           <w:p>
             <w:r>
-              <w:t xml:space="preserve">The </w:t>
-            </w:r>
-            <w:proofErr w:type="spellStart"/>
-            <w:r>
-              <w:t>pwm</w:t>
-            </w:r>
-            <w:proofErr w:type="spellEnd"/>
-            <w:r>
-              <w:t xml:space="preserve"> led for the motor</w:t>
+              <w:t>The pwm led for the motor</w:t>
             </w:r>
             <w:r>
               <w:t xml:space="preserve"> </w:t>
             </w:r>
             <w:r>
-              <w:t xml:space="preserve">controller needs to be 0 when the </w:t>
-            </w:r>
-            <w:proofErr w:type="spellStart"/>
-            <w:r>
-              <w:t>thrtottle</w:t>
-            </w:r>
-            <w:proofErr w:type="spellEnd"/>
-            <w:r>
-              <w:t xml:space="preserve"> is at 0 </w:t>
-            </w:r>
-            <w:r>
-              <w:t xml:space="preserve">(relative to the </w:t>
-            </w:r>
-            <w:proofErr w:type="spellStart"/>
-            <w:r>
-              <w:t>analog</w:t>
-            </w:r>
-            <w:proofErr w:type="spellEnd"/>
-            <w:r>
-              <w:t xml:space="preserve"> hall sensors value) this is </w:t>
-            </w:r>
-            <w:proofErr w:type="spellStart"/>
-            <w:r>
-              <w:t>becauss</w:t>
-            </w:r>
-            <w:proofErr w:type="spellEnd"/>
-            <w:r>
-              <w:t xml:space="preserve"> the motor controller will take that as an input signal and will engage the </w:t>
-            </w:r>
-            <w:r>
+              <w:t xml:space="preserve">controller needs to be 0 when the thrtottle is at 0 </w:t>
+            </w:r>
+            <w:r>
+              <w:t xml:space="preserve">(relative to the analog hall sensors value) this is becauss the motor controller will take that as an input signal and will engage the </w:t>
+            </w:r>
+            <w:r>
+              <w:lastRenderedPageBreak/>
               <w:t>motor constantly and it can then be damaged</w:t>
             </w:r>
           </w:p>
@@ -2646,15 +2490,8 @@
           </w:tcPr>
           <w:p>
             <w:r>
-              <w:t xml:space="preserve">When the throttle is at position 0 make sure </w:t>
-            </w:r>
-            <w:proofErr w:type="spellStart"/>
-            <w:r>
-              <w:t>pwm</w:t>
-            </w:r>
-            <w:proofErr w:type="spellEnd"/>
-            <w:r>
-              <w:t xml:space="preserve"> led is0</w:t>
+              <w:lastRenderedPageBreak/>
+              <w:t>When the throttle is at position 0 make sure pwm led is0</w:t>
             </w:r>
           </w:p>
         </w:tc>
@@ -2697,32 +2534,11 @@
             <w:r>
               <w:t xml:space="preserve">In the app </w:t>
             </w:r>
-            <w:proofErr w:type="spellStart"/>
-            <w:r>
-              <w:t>proggramme</w:t>
-            </w:r>
-            <w:proofErr w:type="spellEnd"/>
-            <w:r>
-              <w:t xml:space="preserve"> make a throttle mapping button to adjust how the motor behaves with the throttle inputs</w:t>
-            </w:r>
-            <w:r>
-              <w:t xml:space="preserve"> and make sure that it saves so that when you start the bike up again you don’t have </w:t>
-            </w:r>
-            <w:proofErr w:type="spellStart"/>
-            <w:r>
-              <w:t>tp</w:t>
-            </w:r>
-            <w:proofErr w:type="spellEnd"/>
-            <w:r>
-              <w:t xml:space="preserve"> redo the settings (this can be done with </w:t>
-            </w:r>
-            <w:proofErr w:type="spellStart"/>
-            <w:r>
-              <w:t>epprom</w:t>
-            </w:r>
-            <w:proofErr w:type="spellEnd"/>
-            <w:r>
-              <w:t>)</w:t>
+            <w:r>
+              <w:t>proggramme make a throttle mapping button to adjust how the motor behaves with the throttle inputs</w:t>
+            </w:r>
+            <w:r>
+              <w:t xml:space="preserve"> and make sure that it saves so that when you start the bike up again you don’t have tp redo the settings (this can be done with epprom)</w:t>
             </w:r>
           </w:p>
         </w:tc>
@@ -2755,11 +2571,7 @@
               <w:t xml:space="preserve">to show what rpm the motor is spinning at </w:t>
             </w:r>
             <w:r>
-              <w:t xml:space="preserve"> and of course in the app be able to adjust because it can be inaccurate but if you can adjust </w:t>
-            </w:r>
-            <w:r>
-              <w:lastRenderedPageBreak/>
-              <w:t xml:space="preserve">it you can adjust how accurate it is </w:t>
+              <w:t xml:space="preserve"> and of course in the app be able to adjust because it can be inaccurate but if you can adjust it you can adjust how accurate it is </w:t>
             </w:r>
           </w:p>
         </w:tc>
@@ -2770,49 +2582,11 @@
           </w:tcPr>
           <w:p>
             <w:r>
-              <w:lastRenderedPageBreak/>
-              <w:t xml:space="preserve">Put in </w:t>
-            </w:r>
-            <w:proofErr w:type="spellStart"/>
-            <w:r>
-              <w:t>leds</w:t>
-            </w:r>
-            <w:proofErr w:type="spellEnd"/>
-            <w:r>
-              <w:t xml:space="preserve"> and put in </w:t>
-            </w:r>
-            <w:proofErr w:type="spellStart"/>
-            <w:r>
-              <w:t>proggramme</w:t>
-            </w:r>
-            <w:proofErr w:type="spellEnd"/>
-            <w:r>
-              <w:t xml:space="preserve"> for </w:t>
-            </w:r>
-            <w:proofErr w:type="spellStart"/>
-            <w:r>
-              <w:t>leds</w:t>
-            </w:r>
-            <w:proofErr w:type="spellEnd"/>
-            <w:r>
-              <w:t xml:space="preserve"> and a way to adjust it also making sure that it saves otherwise it can b</w:t>
-            </w:r>
-            <w:r>
-              <w:t xml:space="preserve">og up the </w:t>
-            </w:r>
-            <w:proofErr w:type="gramStart"/>
-            <w:r>
-              <w:t>system(</w:t>
-            </w:r>
-            <w:proofErr w:type="gramEnd"/>
-            <w:r>
-              <w:t xml:space="preserve">this can be done through </w:t>
-            </w:r>
-            <w:proofErr w:type="spellStart"/>
-            <w:r>
-              <w:t>eppprom</w:t>
-            </w:r>
-            <w:proofErr w:type="spellEnd"/>
+              <w:t>Put in leds and put in proggramme for leds and a way to adjust it also making sure that it saves otherwise it can b</w:t>
+            </w:r>
+            <w:r>
+              <w:t>og up the system(this can be done through eppprom</w:t>
+            </w:r>
           </w:p>
         </w:tc>
       </w:tr>
@@ -3037,15 +2811,7 @@
         <w:t xml:space="preserve"> or location</w:t>
       </w:r>
       <w:r>
-        <w:t xml:space="preserve"> to your </w:t>
-      </w:r>
-      <w:proofErr w:type="gramStart"/>
-      <w:r>
-        <w:t>final outcome</w:t>
-      </w:r>
-      <w:proofErr w:type="gramEnd"/>
-      <w:r>
-        <w:t xml:space="preserve"> </w:t>
+        <w:t xml:space="preserve"> to your final outcome </w:t>
       </w:r>
       <w:r>
         <w:t xml:space="preserve">before testing </w:t>
@@ -3133,13 +2899,8 @@
             <w:shd w:val="clear" w:color="auto" w:fill="FFCCCC"/>
           </w:tcPr>
           <w:p>
-            <w:proofErr w:type="gramStart"/>
-            <w:r>
-              <w:t>Is</w:t>
-            </w:r>
-            <w:proofErr w:type="gramEnd"/>
-            <w:r>
-              <w:t xml:space="preserve"> there any spelling mistakes that were made </w:t>
+            <w:r>
+              <w:t xml:space="preserve">Is there any spelling mistakes that were made </w:t>
             </w:r>
           </w:p>
         </w:tc>
@@ -3179,13 +2940,8 @@
             <w:shd w:val="clear" w:color="auto" w:fill="FFCCCC"/>
           </w:tcPr>
           <w:p>
-            <w:proofErr w:type="gramStart"/>
-            <w:r>
-              <w:t>Is</w:t>
-            </w:r>
-            <w:proofErr w:type="gramEnd"/>
-            <w:r>
-              <w:t xml:space="preserve"> there any </w:t>
+            <w:r>
+              <w:t xml:space="preserve">Is there any </w:t>
             </w:r>
             <w:r>
               <w:t xml:space="preserve">grammar mistakes in what I wrote </w:t>
@@ -3199,13 +2955,8 @@
           </w:tcPr>
           <w:p>
             <w:r>
-              <w:t xml:space="preserve">Make sure all grammar is </w:t>
-            </w:r>
-            <w:proofErr w:type="spellStart"/>
-            <w:r>
-              <w:t>correect</w:t>
-            </w:r>
-            <w:proofErr w:type="spellEnd"/>
+              <w:t>Make sure all grammar is correect</w:t>
+            </w:r>
           </w:p>
         </w:tc>
       </w:tr>
@@ -3242,15 +2993,7 @@
           </w:tcPr>
           <w:p>
             <w:r>
-              <w:t xml:space="preserve">Make sure all the people that helped through the development of the project gets credited for </w:t>
-            </w:r>
-            <w:proofErr w:type="spellStart"/>
-            <w:r>
-              <w:t>there</w:t>
-            </w:r>
-            <w:proofErr w:type="spellEnd"/>
-            <w:r>
-              <w:t xml:space="preserve"> </w:t>
+              <w:t xml:space="preserve">Make sure all the people that helped through the development of the project gets credited for there </w:t>
             </w:r>
             <w:r>
               <w:t>work</w:t>
@@ -3356,26 +3099,14 @@
           </w:tcPr>
           <w:p>
             <w:r>
-              <w:t xml:space="preserve">Is what </w:t>
-            </w:r>
-            <w:proofErr w:type="spellStart"/>
-            <w:r>
-              <w:t>im</w:t>
-            </w:r>
-            <w:proofErr w:type="spellEnd"/>
-            <w:r>
-              <w:t xml:space="preserve"> conveying understandable to a person who know nothing of </w:t>
-            </w:r>
-            <w:r>
-              <w:t xml:space="preserve">what </w:t>
-            </w:r>
-            <w:proofErr w:type="spellStart"/>
-            <w:r>
-              <w:t>im</w:t>
-            </w:r>
-            <w:proofErr w:type="spellEnd"/>
-            <w:r>
-              <w:t xml:space="preserve"> making and how easy is It for them to read this text and see what is going on in a very easy way</w:t>
+              <w:t xml:space="preserve">Is what im conveying understandable to a person who know nothing of </w:t>
+            </w:r>
+            <w:r>
+              <w:t xml:space="preserve">what im making and how easy is It for them to read </w:t>
+            </w:r>
+            <w:r>
+              <w:lastRenderedPageBreak/>
+              <w:t>this text and see what is going on in a very easy way</w:t>
             </w:r>
           </w:p>
         </w:tc>
@@ -3386,6 +3117,7 @@
           </w:tcPr>
           <w:p>
             <w:r>
+              <w:lastRenderedPageBreak/>
               <w:t>Make sure it is understandable</w:t>
             </w:r>
           </w:p>
@@ -3413,15 +3145,7 @@
           </w:tcPr>
           <w:p>
             <w:r>
-              <w:t xml:space="preserve">Is the way that the </w:t>
-            </w:r>
-            <w:proofErr w:type="gramStart"/>
-            <w:r>
-              <w:t>final outcome</w:t>
-            </w:r>
-            <w:proofErr w:type="gramEnd"/>
-            <w:r>
-              <w:t xml:space="preserve"> looks aesthetically pleasing </w:t>
+              <w:t xml:space="preserve">Is the way that the final outcome looks aesthetically pleasing </w:t>
             </w:r>
           </w:p>
         </w:tc>
@@ -3485,13 +3209,8 @@
       <w:pPr>
         <w:pStyle w:val="Heading3"/>
       </w:pPr>
-      <w:proofErr w:type="gramStart"/>
-      <w:r>
-        <w:t>Final Outcome</w:t>
-      </w:r>
-      <w:proofErr w:type="gramEnd"/>
-      <w:r>
-        <w:t xml:space="preserve"> after Testing</w:t>
+      <w:r>
+        <w:t>Final Outcome after Testing</w:t>
       </w:r>
     </w:p>
     <w:p>
@@ -3499,15 +3218,7 @@
         <w:shd w:val="clear" w:color="auto" w:fill="FFF2CC" w:themeFill="accent4" w:themeFillTint="33"/>
       </w:pPr>
       <w:r>
-        <w:t xml:space="preserve">Please provide a link to your </w:t>
-      </w:r>
-      <w:proofErr w:type="gramStart"/>
-      <w:r>
-        <w:t>final outcome</w:t>
-      </w:r>
-      <w:proofErr w:type="gramEnd"/>
-      <w:r>
-        <w:t xml:space="preserve"> after testing has been completed. </w:t>
+        <w:t xml:space="preserve">Please provide a link to your final outcome after testing has been completed. </w:t>
       </w:r>
     </w:p>
     <w:p/>
@@ -3532,7 +3243,6 @@
         <w:shd w:val="clear" w:color="auto" w:fill="FFF2CC" w:themeFill="accent4" w:themeFillTint="33"/>
       </w:pPr>
       <w:r>
-        <w:lastRenderedPageBreak/>
         <w:t>Write a paragraph explaining how information from testing and trialling helped develop the outcome</w:t>
       </w:r>
     </w:p>
@@ -3558,21 +3268,7 @@
         <w:rPr>
           <w:color w:val="EE0000"/>
         </w:rPr>
-        <w:t xml:space="preserve">Delete the red comments such as this one when you are </w:t>
-      </w:r>
-      <w:proofErr w:type="gramStart"/>
-      <w:r>
-        <w:rPr>
-          <w:color w:val="EE0000"/>
-        </w:rPr>
-        <w:t>done</w:t>
-      </w:r>
-      <w:proofErr w:type="gramEnd"/>
-      <w:r>
-        <w:rPr>
-          <w:color w:val="EE0000"/>
-        </w:rPr>
-        <w:t xml:space="preserve"> they are to help you writing your paragraphs</w:t>
+        <w:t>Delete the red comments such as this one when you are done they are to help you writing your paragraphs</w:t>
       </w:r>
     </w:p>
     <w:p>
@@ -3717,141 +3413,115 @@
           <w:lang w:val="en-US"/>
         </w:rPr>
         <w:br/>
-        <w:t xml:space="preserve">Information X Y Z for </w:t>
-      </w:r>
-      <w:proofErr w:type="spellStart"/>
-      <w:proofErr w:type="gramStart"/>
-      <w:r>
+        <w:t>Information X Y Z for trialling</w:t>
+      </w:r>
+    </w:p>
+    <w:p>
+      <w:pPr>
+        <w:shd w:val="clear" w:color="auto" w:fill="A8D08D" w:themeFill="accent6" w:themeFillTint="99"/>
         <w:rPr>
           <w:color w:val="EE0000"/>
           <w:lang w:val="en-US"/>
         </w:rPr>
-        <w:t>trialling</w:t>
-      </w:r>
-      <w:proofErr w:type="spellEnd"/>
-      <w:proofErr w:type="gramEnd"/>
-    </w:p>
-    <w:p>
-      <w:pPr>
-        <w:shd w:val="clear" w:color="auto" w:fill="A8D08D" w:themeFill="accent6" w:themeFillTint="99"/>
+      </w:pPr>
+      <w:r>
         <w:rPr>
           <w:color w:val="EE0000"/>
           <w:lang w:val="en-US"/>
         </w:rPr>
-      </w:pPr>
-      <w:r>
+        <w:t>Synthesis conclusion statement</w:t>
+      </w:r>
+    </w:p>
+    <w:p>
+      <w:pPr>
+        <w:shd w:val="clear" w:color="auto" w:fill="A8D08D" w:themeFill="accent6" w:themeFillTint="99"/>
+        <w:rPr>
+          <w:color w:val="EE0000"/>
+        </w:rPr>
+      </w:pPr>
+    </w:p>
+    <w:p>
+      <w:pPr>
+        <w:shd w:val="clear" w:color="auto" w:fill="A8D08D" w:themeFill="accent6" w:themeFillTint="99"/>
         <w:rPr>
           <w:color w:val="EE0000"/>
           <w:lang w:val="en-US"/>
         </w:rPr>
-        <w:t>Synthesis conclusion statement</w:t>
-      </w:r>
-    </w:p>
-    <w:p>
-      <w:pPr>
-        <w:shd w:val="clear" w:color="auto" w:fill="A8D08D" w:themeFill="accent6" w:themeFillTint="99"/>
-        <w:rPr>
-          <w:color w:val="EE0000"/>
-        </w:rPr>
-      </w:pPr>
-    </w:p>
-    <w:p>
-      <w:pPr>
-        <w:shd w:val="clear" w:color="auto" w:fill="A8D08D" w:themeFill="accent6" w:themeFillTint="99"/>
+      </w:pPr>
+      <w:r>
         <w:rPr>
           <w:color w:val="EE0000"/>
           <w:lang w:val="en-US"/>
         </w:rPr>
-      </w:pPr>
-      <w:r>
+        <w:t xml:space="preserve">Paragraph 4 </w:t>
+      </w:r>
+    </w:p>
+    <w:p>
+      <w:pPr>
+        <w:shd w:val="clear" w:color="auto" w:fill="A8D08D" w:themeFill="accent6" w:themeFillTint="99"/>
         <w:rPr>
           <w:color w:val="EE0000"/>
           <w:lang w:val="en-US"/>
         </w:rPr>
-        <w:t xml:space="preserve">Paragraph 4 </w:t>
-      </w:r>
-    </w:p>
-    <w:p>
-      <w:pPr>
-        <w:shd w:val="clear" w:color="auto" w:fill="A8D08D" w:themeFill="accent6" w:themeFillTint="99"/>
+      </w:pPr>
+      <w:r>
         <w:rPr>
           <w:color w:val="EE0000"/>
           <w:lang w:val="en-US"/>
         </w:rPr>
-      </w:pPr>
-      <w:r>
+        <w:lastRenderedPageBreak/>
+        <w:t>Combine Synthesis conclusions</w:t>
+      </w:r>
+    </w:p>
+    <w:p>
+      <w:pPr>
+        <w:shd w:val="clear" w:color="auto" w:fill="A8D08D" w:themeFill="accent6" w:themeFillTint="99"/>
+      </w:pPr>
+    </w:p>
+    <w:p>
+      <w:pPr>
+        <w:pStyle w:val="Heading2"/>
+        <w:shd w:val="clear" w:color="auto" w:fill="A8D08D" w:themeFill="accent6" w:themeFillTint="99"/>
+      </w:pPr>
+      <w:r>
+        <w:t>Discussion of this information</w:t>
+      </w:r>
+    </w:p>
+    <w:p>
+      <w:pPr>
+        <w:shd w:val="clear" w:color="auto" w:fill="A8D08D" w:themeFill="accent6" w:themeFillTint="99"/>
+      </w:pPr>
+    </w:p>
+    <w:p>
+      <w:pPr>
+        <w:shd w:val="clear" w:color="auto" w:fill="A8D08D" w:themeFill="accent6" w:themeFillTint="99"/>
         <w:rPr>
           <w:color w:val="EE0000"/>
           <w:lang w:val="en-US"/>
         </w:rPr>
-        <w:t>Combine Synthesis conclusions</w:t>
-      </w:r>
-    </w:p>
-    <w:p>
-      <w:pPr>
-        <w:shd w:val="clear" w:color="auto" w:fill="A8D08D" w:themeFill="accent6" w:themeFillTint="99"/>
-      </w:pPr>
-    </w:p>
-    <w:p>
-      <w:pPr>
-        <w:pStyle w:val="Heading2"/>
-        <w:shd w:val="clear" w:color="auto" w:fill="A8D08D" w:themeFill="accent6" w:themeFillTint="99"/>
-      </w:pPr>
-      <w:r>
-        <w:t>Discussion of this information</w:t>
-      </w:r>
-    </w:p>
-    <w:p>
-      <w:pPr>
-        <w:shd w:val="clear" w:color="auto" w:fill="A8D08D" w:themeFill="accent6" w:themeFillTint="99"/>
-      </w:pPr>
-    </w:p>
-    <w:p>
-      <w:pPr>
-        <w:shd w:val="clear" w:color="auto" w:fill="A8D08D" w:themeFill="accent6" w:themeFillTint="99"/>
+      </w:pPr>
+      <w:r>
         <w:rPr>
           <w:color w:val="EE0000"/>
           <w:lang w:val="en-US"/>
         </w:rPr>
-      </w:pPr>
-      <w:r>
+        <w:t>Paragraph 5/6</w:t>
+      </w:r>
+    </w:p>
+    <w:p>
+      <w:pPr>
+        <w:shd w:val="clear" w:color="auto" w:fill="A8D08D" w:themeFill="accent6" w:themeFillTint="99"/>
         <w:rPr>
           <w:color w:val="EE0000"/>
           <w:lang w:val="en-US"/>
         </w:rPr>
-        <w:t>Paragraph 5/6</w:t>
-      </w:r>
-    </w:p>
-    <w:p>
-      <w:pPr>
-        <w:shd w:val="clear" w:color="auto" w:fill="A8D08D" w:themeFill="accent6" w:themeFillTint="99"/>
+      </w:pPr>
+      <w:r>
         <w:rPr>
           <w:color w:val="EE0000"/>
           <w:lang w:val="en-US"/>
         </w:rPr>
-      </w:pPr>
-      <w:r>
-        <w:rPr>
-          <w:color w:val="EE0000"/>
-          <w:lang w:val="en-US"/>
-        </w:rPr>
-        <w:t xml:space="preserve">Discuss how synthesis has helped develop a </w:t>
-      </w:r>
-      <w:proofErr w:type="gramStart"/>
-      <w:r>
-        <w:rPr>
-          <w:color w:val="EE0000"/>
-          <w:lang w:val="en-US"/>
-        </w:rPr>
-        <w:t>high quality</w:t>
-      </w:r>
-      <w:proofErr w:type="gramEnd"/>
-      <w:r>
-        <w:rPr>
-          <w:color w:val="EE0000"/>
-          <w:lang w:val="en-US"/>
-        </w:rPr>
-        <w:t xml:space="preserve"> outcome, you can use screenshots as evidence</w:t>
+        <w:t>Discuss how synthesis has helped develop a high quality outcome, you can use screenshots as evidence</w:t>
       </w:r>
     </w:p>
     <w:p>

</xml_diff>